<commit_message>
Add actionable cybersecurity protection steps
</commit_message>
<xml_diff>
--- a/docs/Cybersecurity_Plan_EYOUTH-30909090117044.docx
+++ b/docs/Cybersecurity_Plan_EYOUTH-30909090117044.docx
@@ -24,7 +24,7 @@
     </w:p>
     <w:p>
       <w:r>
-        <w:t>This plan lists one simple risk and one matching protection method for each Future Mall system.</w:t>
+        <w:t>This plan shows the risks in Future Mall and the simple actions that staff should take to reduce them.</w:t>
       </w:r>
     </w:p>
     <w:tbl>
@@ -180,6 +180,47 @@
         </w:tc>
       </w:tr>
     </w:tbl>
+    <w:p>
+      <w:pPr>
+        <w:pStyle w:val="Heading1"/>
+      </w:pPr>
+      <w:r>
+        <w:t>Protection Plan Steps</w:t>
+      </w:r>
+    </w:p>
+    <w:p>
+      <w:r>
+        <w:rPr>
+          <w:b/>
+        </w:rPr>
+        <w:t xml:space="preserve">1. Secure the Wi-Fi </w:t>
+      </w:r>
+      <w:r>
+        <w:t>Set a strong password for the staff network. Keep the guest Wi-Fi separate, then change the password if an employee leaves.</w:t>
+      </w:r>
+    </w:p>
+    <w:p>
+      <w:r>
+        <w:rPr>
+          <w:b/>
+        </w:rPr>
+        <w:t xml:space="preserve">2. Protect the cashier device </w:t>
+      </w:r>
+      <w:r>
+        <w:t>Install antivirus software, turn on automatic updates, and scan the cashier device every week.</w:t>
+      </w:r>
+    </w:p>
+    <w:p>
+      <w:r>
+        <w:rPr>
+          <w:b/>
+        </w:rPr>
+        <w:t xml:space="preserve">3. Protect the website </w:t>
+      </w:r>
+      <w:r>
+        <w:t>Use HTTPS, give the administrator a strong password, and check for website updates every month.</w:t>
+      </w:r>
+    </w:p>
     <w:p>
       <w:pPr>
         <w:pStyle w:val="Heading1"/>

</xml_diff>